<commit_message>
Update documentation aesthetics: professional TOC and clean headings
</commit_message>
<xml_diff>
--- a/docs/MASTER_PROJECT_DOCUMENTATION.docx
+++ b/docs/MASTER_PROJECT_DOCUMENTATION.docx
@@ -7,7 +7,7 @@
         <w:pStyle w:val="Title"/>
       </w:pPr>
       <w:r>
-        <w:t>Master Project Documentation: Plagiarism Detection Service (v3.0.0)</w:t>
+        <w:t>Master Project Documentation: Plagiarism Detection Service</w:t>
       </w:r>
     </w:p>
     <w:p>
@@ -39,138 +39,186 @@
     <w:p>
       <w:pPr>
         <w:pStyle w:val="ListNumber"/>
+        <w:ind w:left="400"/>
       </w:pPr>
       <w:r>
-        <w:t>[Executive Summary](#1-executive-summary)</w:t>
+        <w:t>Executive Summary</w:t>
       </w:r>
     </w:p>
     <w:p>
       <w:pPr>
         <w:pStyle w:val="ListNumber"/>
+        <w:ind w:left="400"/>
       </w:pPr>
       <w:r>
-        <w:t>[Dual-Engine Architecture](#3-dual-engine-architecture)</w:t>
+        <w:t>Dual-Engine Architecture</w:t>
       </w:r>
     </w:p>
     <w:p>
+      <w:pPr>
+        <w:pStyle w:val="ListBullet2"/>
+      </w:pPr>
       <w:r>
-        <w:t xml:space="preserve">    * [Tokenizer Engine (Winnowing)](#tokenizer-engine-winnowing)</w:t>
+        <w:t>Tokenizer Engine (Winnowing)</w:t>
       </w:r>
     </w:p>
     <w:p>
+      <w:pPr>
+        <w:pStyle w:val="ListBullet2"/>
+      </w:pPr>
       <w:r>
-        <w:t xml:space="preserve">    * [AST Engine (Structural Winnowing)](#ast-engine-structural-winnowing)</w:t>
+        <w:t>AST Engine (Structural Winnowing)</w:t>
       </w:r>
     </w:p>
     <w:p>
       <w:pPr>
         <w:pStyle w:val="ListNumber"/>
+        <w:ind w:left="400"/>
       </w:pPr>
       <w:r>
-        <w:t>[The 6 Architectural Fixes](#4-the-6-architectural-fixes)</w:t>
+        <w:t>The 6 Architectural Fixes</w:t>
       </w:r>
     </w:p>
     <w:p>
+      <w:pPr>
+        <w:pStyle w:val="ListBullet2"/>
+      </w:pPr>
       <w:r>
-        <w:t xml:space="preserve">    * [Fix 1: Language-Based Grouping](#fix-1-language-based-grouping)</w:t>
+        <w:t>Fix 1: Language-Based Grouping</w:t>
       </w:r>
     </w:p>
     <w:p>
+      <w:pPr>
+        <w:pStyle w:val="ListBullet2"/>
+      </w:pPr>
       <w:r>
-        <w:t xml:space="preserve">    * [Fix 2: Independent AST Pipeline](#fix-2-independent-ast-pipeline)</w:t>
+        <w:t>Fix 2: Independent AST Pipeline</w:t>
       </w:r>
     </w:p>
     <w:p>
+      <w:pPr>
+        <w:pStyle w:val="ListBullet2"/>
+      </w:pPr>
       <w:r>
-        <w:t xml:space="preserve">    * [Fix 3: AST Winnowing](#fix-3-ast-winnowing)</w:t>
+        <w:t>Fix 3: AST Winnowing</w:t>
       </w:r>
     </w:p>
     <w:p>
+      <w:pPr>
+        <w:pStyle w:val="ListBullet2"/>
+      </w:pPr>
       <w:r>
-        <w:t xml:space="preserve">    * [Fix 4: Label-Derived Metrics](#fix-4-label-derived-metrics)</w:t>
+        <w:t>Fix 4: Label-Derived Metrics</w:t>
       </w:r>
     </w:p>
     <w:p>
+      <w:pPr>
+        <w:pStyle w:val="ListBullet2"/>
+      </w:pPr>
       <w:r>
-        <w:t xml:space="preserve">    * [Fix 5: Neutral Recalibration](#fix-5-neutral-recalibration)</w:t>
+        <w:t>Fix 5: Neutral Recalibration</w:t>
       </w:r>
     </w:p>
     <w:p>
+      <w:pPr>
+        <w:pStyle w:val="ListBullet2"/>
+      </w:pPr>
       <w:r>
-        <w:t xml:space="preserve">    * [Fix 6: Strict Token Gating](#fix-6-strict-token-gating)</w:t>
+        <w:t>Fix 6: Strict Token Gating</w:t>
       </w:r>
     </w:p>
     <w:p>
       <w:pPr>
         <w:pStyle w:val="ListNumber"/>
+        <w:ind w:left="400"/>
       </w:pPr>
       <w:r>
-        <w:t>[Technology Stack &amp; Supported Languages](#5-technology-stack--supported-languages)</w:t>
+        <w:t>Technology Stack &amp; Supported Languages</w:t>
       </w:r>
     </w:p>
     <w:p>
       <w:pPr>
         <w:pStyle w:val="ListNumber"/>
+        <w:ind w:left="400"/>
       </w:pPr>
       <w:r>
-        <w:t>[Implementation Deep Dive](#6-implementation-deep-dive)</w:t>
+        <w:t>Implementation Deep Dive</w:t>
       </w:r>
     </w:p>
     <w:p>
+      <w:pPr>
+        <w:pStyle w:val="ListBullet2"/>
+      </w:pPr>
       <w:r>
-        <w:t xml:space="preserve">    * [Winnowing Algorithm](#winnowing-algorithm)</w:t>
+        <w:t>Winnowing Algorithm</w:t>
       </w:r>
     </w:p>
     <w:p>
+      <w:pPr>
+        <w:pStyle w:val="ListBullet2"/>
+      </w:pPr>
       <w:r>
-        <w:t xml:space="preserve">    * [AST Normalization Logic](#ast-normalization-logic)</w:t>
+        <w:t>AST Normalization Logic</w:t>
       </w:r>
     </w:p>
     <w:p>
       <w:pPr>
         <w:pStyle w:val="ListNumber"/>
+        <w:ind w:left="400"/>
       </w:pPr>
       <w:r>
-        <w:t>[Evasion Case Studies](#7-evasion-case-studies)</w:t>
+        <w:t>Evasion Case Studies</w:t>
       </w:r>
     </w:p>
     <w:p>
+      <w:pPr>
+        <w:pStyle w:val="ListBullet2"/>
+      </w:pPr>
       <w:r>
-        <w:t xml:space="preserve">    * [Python: Obnoxious Obfuscation](#python-obnoxious-obfuscation)</w:t>
+        <w:t>Python: Obnoxious Obfuscation</w:t>
       </w:r>
     </w:p>
     <w:p>
+      <w:pPr>
+        <w:pStyle w:val="ListBullet2"/>
+      </w:pPr>
       <w:r>
-        <w:t xml:space="preserve">    * [JavaScript: Control Flow Mutation](#javascript-control-flow-mutation)</w:t>
+        <w:t>JavaScript: Control Flow Mutation</w:t>
       </w:r>
     </w:p>
     <w:p>
+      <w:pPr>
+        <w:pStyle w:val="ListBullet2"/>
+      </w:pPr>
       <w:r>
-        <w:t xml:space="preserve">    * [Java: Noise Injection](#java-noise-injection)</w:t>
+        <w:t>Java: Noise Injection</w:t>
       </w:r>
     </w:p>
     <w:p>
       <w:pPr>
         <w:pStyle w:val="ListNumber"/>
+        <w:ind w:left="400"/>
       </w:pPr>
       <w:r>
-        <w:t>[API Reference &amp; Usage](#8-api-reference--usage)</w:t>
+        <w:t>API Reference &amp; Usage</w:t>
       </w:r>
     </w:p>
     <w:p>
       <w:pPr>
         <w:pStyle w:val="ListNumber"/>
+        <w:ind w:left="400"/>
       </w:pPr>
       <w:r>
-        <w:t>[Setup &amp; Deployment](#9-setup--deployment)</w:t>
+        <w:t>Setup &amp; Deployment</w:t>
       </w:r>
     </w:p>
     <w:p>
       <w:pPr>
         <w:pStyle w:val="ListNumber"/>
+        <w:ind w:left="400"/>
       </w:pPr>
       <w:r>
-        <w:t>[Conclusion &amp; Future Roadmap](#10-conclusion-&amp;amp;-future-roadmap)</w:t>
+        <w:t>Conclusion &amp; Future Roadmap</w:t>
       </w:r>
     </w:p>
     <w:p>
@@ -204,7 +252,7 @@
         <w:pStyle w:val="ListBullet"/>
       </w:pPr>
       <w:r>
-        <w:t xml:space="preserve">  **Normalization**: Code is stripped of comments and all identifiers (variable/function names) are replaced with a generic `VAR` tag. Strings are generalized to `STR`.</w:t>
+        <w:t>Normalization: Code is stripped of comments and all identifiers (variable/function names) are replaced with a generic `VAR` tag. Strings are generalized to `STR`.</w:t>
       </w:r>
     </w:p>
     <w:p>
@@ -212,7 +260,7 @@
         <w:pStyle w:val="ListBullet"/>
       </w:pPr>
       <w:r>
-        <w:t xml:space="preserve">  **Winnowing**: The engine uses the MOSS-standard Winnowing algorithm. It hashes sliding k-gram windows and selects a subset of fingerprints that are stable across code insertions.</w:t>
+        <w:t>Winnowing: The engine uses the MOSS-standard Winnowing algorithm. It hashes sliding k-gram windows and selects a subset of fingerprints that are stable across code insertions.</w:t>
       </w:r>
     </w:p>
     <w:p>
@@ -220,7 +268,7 @@
         <w:pStyle w:val="ListBullet"/>
       </w:pPr>
       <w:r>
-        <w:t xml:space="preserve">  **Strength**: Highly resistant to "Noise Injection" (adding dummy print statements or comments).</w:t>
+        <w:t>Strength: Highly resistant to "Noise Injection" (adding dummy print statements or comments).</w:t>
       </w:r>
     </w:p>
     <w:p>
@@ -241,7 +289,7 @@
         <w:pStyle w:val="ListBullet"/>
       </w:pPr>
       <w:r>
-        <w:t xml:space="preserve">  **Tree-Sitter Integration**: Uses universal parsers to convert code into Abstract Syntax Trees.</w:t>
+        <w:t>Tree-Sitter Integration: Uses universal parsers to convert code into Abstract Syntax Trees.</w:t>
       </w:r>
     </w:p>
     <w:p>
@@ -249,7 +297,7 @@
         <w:pStyle w:val="ListBullet"/>
       </w:pPr>
       <w:r>
-        <w:t xml:space="preserve">  **Structural Filtering**: Ignores raw text and expressions, focusing entirely on structure: loops, conditionals, assignments, and class definitions.</w:t>
+        <w:t>Structural Filtering: Ignores raw text and expressions, focusing entirely on structure: loops, conditionals, assignments, and class definitions.</w:t>
       </w:r>
     </w:p>
     <w:p>
@@ -257,7 +305,7 @@
         <w:pStyle w:val="ListBullet"/>
       </w:pPr>
       <w:r>
-        <w:t xml:space="preserve">  **Structural Winnowing**: Hashing is applied to the sequence of AST node types, mathematically preserving the "shape" of the code regardless of naming conventions.</w:t>
+        <w:t>Structural Winnowing: Hashing is applied to the sequence of AST node types, mathematically preserving the "shape" of the code regardless of naming conventions.</w:t>
       </w:r>
     </w:p>
     <w:p>
@@ -265,7 +313,7 @@
         <w:pStyle w:val="ListBullet"/>
       </w:pPr>
       <w:r>
-        <w:t xml:space="preserve">  **Strength**: Catches "Smart Plagiarism" where every variable is renamed but the logic remains identical.</w:t>
+        <w:t>Strength: Catches "Smart Plagiarism" where every variable is renamed but the logic remains identical.</w:t>
       </w:r>
     </w:p>
     <w:p>
@@ -294,7 +342,7 @@
         <w:pStyle w:val="ListBullet"/>
       </w:pPr>
       <w:r>
-        <w:t xml:space="preserve">  **Problem**: Prototype compared different languages (e.g., Python vs Java), causing parser crashes and 0% false negatives.</w:t>
+        <w:t>Problem: Prototype compared different languages (e.g., Python vs Java), causing parser crashes and 0% false negatives.</w:t>
       </w:r>
     </w:p>
     <w:p>
@@ -302,7 +350,7 @@
         <w:pStyle w:val="ListBullet"/>
       </w:pPr>
       <w:r>
-        <w:t xml:space="preserve">  **Fix**: Implemented a **Composite Key Isolation** strategy. Submissions are grouped by `(question_id, language)`.</w:t>
+        <w:t>Fix: Implemented a Composite Key Isolation strategy. Submissions are grouped by `(question_id, language)`.</w:t>
       </w:r>
     </w:p>
     <w:p>
@@ -310,7 +358,7 @@
         <w:pStyle w:val="ListBullet"/>
       </w:pPr>
       <w:r>
-        <w:t xml:space="preserve">  **Result**: 100% stability; systems only compare like-for-like.</w:t>
+        <w:t>Result: 100% stability; systems only compare like-for-like.</w:t>
       </w:r>
     </w:p>
     <w:p>
@@ -326,7 +374,7 @@
         <w:pStyle w:val="ListBullet"/>
       </w:pPr>
       <w:r>
-        <w:t xml:space="preserve">  **Problem**: A "Token Gate" prevented the AST engine from running if token similarity was too low (&lt;25%). Evasive students exploited this by adding noise.</w:t>
+        <w:t>Problem: A "Token Gate" prevented the AST engine from running if token similarity was too low (&lt;25%). Evasive students exploited this by adding noise.</w:t>
       </w:r>
     </w:p>
     <w:p>
@@ -334,7 +382,7 @@
         <w:pStyle w:val="ListBullet"/>
       </w:pPr>
       <w:r>
-        <w:t xml:space="preserve">  **Fix**: The AST engine is now **Always-Active**. Both signals are merged in the final scoring phase.</w:t>
+        <w:t>Fix: The AST engine is now Always-Active. Both signals are merged in the final scoring phase.</w:t>
       </w:r>
     </w:p>
     <w:p>
@@ -342,7 +390,7 @@
         <w:pStyle w:val="ListBullet"/>
       </w:pPr>
       <w:r>
-        <w:t xml:space="preserve">  **Result**: Smart copies that hide behind 15% token overlap are now caught by 90%+ AST overlap.</w:t>
+        <w:t>Result: Smart copies that hide behind 15% token overlap are now caught by 90%+ AST overlap.</w:t>
       </w:r>
     </w:p>
     <w:p>
@@ -358,7 +406,7 @@
         <w:pStyle w:val="ListBullet"/>
       </w:pPr>
       <w:r>
-        <w:t xml:space="preserve">  **Problem**: Naive AST comparison used unordered sets (Jaccard similarity of node types), leading to massive false positives for simple programs.</w:t>
+        <w:t>Problem: Naive AST comparison used unordered sets (Jaccard similarity of node types), leading to massive false positives for simple programs.</w:t>
       </w:r>
     </w:p>
     <w:p>
@@ -366,7 +414,7 @@
         <w:pStyle w:val="ListBullet"/>
       </w:pPr>
       <w:r>
-        <w:t xml:space="preserve">  **Fix**: Implemented **Hashed Sliding Windows** for AST nodes.</w:t>
+        <w:t>Fix: Implemented Hashed Sliding Windows for AST nodes.</w:t>
       </w:r>
     </w:p>
     <w:p>
@@ -374,7 +422,7 @@
         <w:pStyle w:val="ListBullet"/>
       </w:pPr>
       <w:r>
-        <w:t xml:space="preserve">  **Result**: Structural order is preserved; two different programs using `if/for` are no longer flagged as identical.</w:t>
+        <w:t>Result: Structural order is preserved; two different programs using `if/for` are no longer flagged as identical.</w:t>
       </w:r>
     </w:p>
     <w:p>
@@ -390,7 +438,7 @@
         <w:pStyle w:val="ListBullet"/>
       </w:pPr>
       <w:r>
-        <w:t xml:space="preserve">  **Problem**: The developer dashboard calculated "Exact Matches" using only token similarity, missing AST-detected smart copies.</w:t>
+        <w:t>Problem: The developer dashboard calculated "Exact Matches" using only token similarity, missing AST-detected smart copies.</w:t>
       </w:r>
     </w:p>
     <w:p>
@@ -398,7 +446,7 @@
         <w:pStyle w:val="ListBullet"/>
       </w:pPr>
       <w:r>
-        <w:t xml:space="preserve">  **Fix**: Metrics are now derived directly from the **Final Confidence Label**.</w:t>
+        <w:t>Fix: Metrics are now derived directly from the Final Confidence Label.</w:t>
       </w:r>
     </w:p>
     <w:p>
@@ -406,7 +454,7 @@
         <w:pStyle w:val="ListBullet"/>
       </w:pPr>
       <w:r>
-        <w:t xml:space="preserve">  **Result**: Dashboard accuracy now reflects the combined intelligence of both engines.</w:t>
+        <w:t>Result: Dashboard accuracy now reflects the combined intelligence of both engines.</w:t>
       </w:r>
     </w:p>
     <w:p>
@@ -422,7 +470,7 @@
         <w:pStyle w:val="ListBullet"/>
       </w:pPr>
       <w:r>
-        <w:t xml:space="preserve">  **Problem**: Labels like "Suspicious" or "Copy Detected" created legal liability for the company.</w:t>
+        <w:t>Problem: Labels like "Suspicious" or "Copy Detected" created legal liability for the company.</w:t>
       </w:r>
     </w:p>
     <w:p>
@@ -430,7 +478,7 @@
         <w:pStyle w:val="ListBullet"/>
       </w:pPr>
       <w:r>
-        <w:t xml:space="preserve">  **Fix**: Transitioned to **Signal-Based Taxonomy** (e.g., "High Structural Similarity," "Exact Text Overlap").</w:t>
+        <w:t>Fix: Transitioned to Signal-Based Taxonomy (e.g., "High Structural Similarity," "Exact Text Overlap").</w:t>
       </w:r>
     </w:p>
     <w:p>
@@ -438,7 +486,7 @@
         <w:pStyle w:val="ListBullet"/>
       </w:pPr>
       <w:r>
-        <w:t xml:space="preserve">  **Result**: Neutral, evidentiary reports that protect the business from litigation.</w:t>
+        <w:t>Result: Neutral, evidentiary reports that protect the business from litigation.</w:t>
       </w:r>
     </w:p>
     <w:p>
@@ -467,7 +515,7 @@
         <w:pStyle w:val="ListBullet"/>
       </w:pPr>
       <w:r>
-        <w:t xml:space="preserve">  **Backend**: Python 3.8+ with **FastAPI** for high-performance async processing.</w:t>
+        <w:t>Backend: Python 3.8+ with FastAPI for high-performance async processing.</w:t>
       </w:r>
     </w:p>
     <w:p>
@@ -475,7 +523,7 @@
         <w:pStyle w:val="ListBullet"/>
       </w:pPr>
       <w:r>
-        <w:t xml:space="preserve">  **Parsing Engine**: **Tree-Sitter** (Universal incremental parser).</w:t>
+        <w:t>Parsing Engine: Tree-Sitter (Universal incremental parser).</w:t>
       </w:r>
     </w:p>
     <w:p>
@@ -483,7 +531,7 @@
         <w:pStyle w:val="ListBullet"/>
       </w:pPr>
       <w:r>
-        <w:t xml:space="preserve">  **Database**: **PostgreSQL** (Optimized for Neon serverless).</w:t>
+        <w:t>Database: PostgreSQL (Optimized for Neon serverless).</w:t>
       </w:r>
     </w:p>
     <w:p>
@@ -491,7 +539,7 @@
         <w:pStyle w:val="ListBullet"/>
       </w:pPr>
       <w:r>
-        <w:t xml:space="preserve">  **Security**: **python-dotenv** for environment isolation.</w:t>
+        <w:t>Security: python-dotenv for environment isolation.</w:t>
       </w:r>
     </w:p>
     <w:p>
@@ -499,7 +547,7 @@
         <w:pStyle w:val="ListBullet"/>
       </w:pPr>
       <w:r>
-        <w:t xml:space="preserve">  **Validation**: **Pydantic v2** for robust API schema enforcement.</w:t>
+        <w:t>Validation: Pydantic v2 for robust API schema enforcement.</w:t>
       </w:r>
     </w:p>
     <w:p>
@@ -520,7 +568,7 @@
         <w:pStyle w:val="ListBullet"/>
       </w:pPr>
       <w:r>
-        <w:t xml:space="preserve">  **Systems**: C, C++, Rust, Go, OCaml.</w:t>
+        <w:t>Systems: C, C++, Rust, Go, OCaml.</w:t>
       </w:r>
     </w:p>
     <w:p>
@@ -528,7 +576,7 @@
         <w:pStyle w:val="ListBullet"/>
       </w:pPr>
       <w:r>
-        <w:t xml:space="preserve">  **Web**: JavaScript, TypeScript, HTML, CSS, PHP, Ruby.</w:t>
+        <w:t>Web: JavaScript, TypeScript, HTML, CSS, PHP, Ruby.</w:t>
       </w:r>
     </w:p>
     <w:p>
@@ -536,7 +584,7 @@
         <w:pStyle w:val="ListBullet"/>
       </w:pPr>
       <w:r>
-        <w:t xml:space="preserve">  **Enterprise**: Java, Kotlin, Scala, SQL.</w:t>
+        <w:t>Enterprise: Java, Kotlin, Scala, SQL.</w:t>
       </w:r>
     </w:p>
     <w:p>
@@ -544,7 +592,7 @@
         <w:pStyle w:val="ListBullet"/>
       </w:pPr>
       <w:r>
-        <w:t xml:space="preserve">  **Scripting**: Python, Bash, Lua.</w:t>
+        <w:t>Scripting: Python, Bash, Lua.</w:t>
       </w:r>
     </w:p>
     <w:p>
@@ -552,7 +600,7 @@
         <w:pStyle w:val="ListBullet"/>
       </w:pPr>
       <w:r>
-        <w:t xml:space="preserve">  **Data/Config**: JSON, YAML, TOML, Haskell, Swift.</w:t>
+        <w:t>Data/Config: JSON, YAML, TOML, Haskell, Swift.</w:t>
       </w:r>
     </w:p>
     <w:p>
@@ -593,27 +641,27 @@
     </w:p>
     <w:p>
       <w:r>
-        <w:t xml:space="preserve">    hashes = [hash(tokens[i:i+k]) for i in range(len(tokens)-k+1)]</w:t>
+        <w:t>hashes = [hash(tokens[i:i+k]) for i in range(len(tokens)-k+1)]</w:t>
       </w:r>
     </w:p>
     <w:p>
       <w:r>
-        <w:t xml:space="preserve">    fingerprints = set()</w:t>
+        <w:t>fingerprints = set()</w:t>
       </w:r>
     </w:p>
     <w:p>
       <w:r>
-        <w:t xml:space="preserve">    for i in range(len(hashes)-window_size+1):</w:t>
+        <w:t>for i in range(len(hashes)-window_size+1):</w:t>
       </w:r>
     </w:p>
     <w:p>
       <w:r>
-        <w:t xml:space="preserve">        fingerprints.add(min(hashes[i:i+window_size]))</w:t>
+        <w:t>fingerprints.add(min(hashes[i:i+window_size]))</w:t>
       </w:r>
     </w:p>
     <w:p>
       <w:r>
-        <w:t xml:space="preserve">    return fingerprints</w:t>
+        <w:t>return fingerprints</w:t>
       </w:r>
     </w:p>
     <w:p>
@@ -650,7 +698,7 @@
         <w:pStyle w:val="ListNumber"/>
       </w:pPr>
       <w:r>
-        <w:t>If node is a variable name or string literal, **Ignore**.</w:t>
+        <w:t>If node is a variable name or string literal, Ignore.</w:t>
       </w:r>
     </w:p>
     <w:p>
@@ -687,7 +735,7 @@
         <w:pStyle w:val="ListBullet"/>
       </w:pPr>
       <w:r>
-        <w:t xml:space="preserve">  **Tactic**: Student renames all variables to 50-character strings and adds 20 `print()` statements.</w:t>
+        <w:t>Tactic: Student renames all variables to 50-character strings and adds 20 `print()` statements.</w:t>
       </w:r>
     </w:p>
     <w:p>
@@ -695,7 +743,7 @@
         <w:pStyle w:val="ListBullet"/>
       </w:pPr>
       <w:r>
-        <w:t xml:space="preserve">  **Tokenizer Signal**: 15% (Low)</w:t>
+        <w:t>Tokenizer Signal: 15% (Low)</w:t>
       </w:r>
     </w:p>
     <w:p>
@@ -703,7 +751,7 @@
         <w:pStyle w:val="ListBullet"/>
       </w:pPr>
       <w:r>
-        <w:t xml:space="preserve">  **AST Signal**: 98% (High)</w:t>
+        <w:t>AST Signal: 98% (High)</w:t>
       </w:r>
     </w:p>
     <w:p>
@@ -711,7 +759,7 @@
         <w:pStyle w:val="ListBullet"/>
       </w:pPr>
       <w:r>
-        <w:t xml:space="preserve">  **System Result**: **CAUGHT** (detected as "Smart copy — variables renamed").</w:t>
+        <w:t>System Result: CAUGHT (detected as "Smart copy ? variables renamed").</w:t>
       </w:r>
     </w:p>
     <w:p>
@@ -727,7 +775,7 @@
         <w:pStyle w:val="ListBullet"/>
       </w:pPr>
       <w:r>
-        <w:t xml:space="preserve">  **Tactic**: Student converts a `for` loop to a `while` loop and extracts some logic into a helper function.</w:t>
+        <w:t>Tactic: Student converts a `for` loop to a `while` loop and extracts some logic into a helper function.</w:t>
       </w:r>
     </w:p>
     <w:p>
@@ -735,7 +783,7 @@
         <w:pStyle w:val="ListBullet"/>
       </w:pPr>
       <w:r>
-        <w:t xml:space="preserve">  **Tokenizer Signal**: 28% (Moderate)</w:t>
+        <w:t>Tokenizer Signal: 28% (Moderate)</w:t>
       </w:r>
     </w:p>
     <w:p>
@@ -743,7 +791,7 @@
         <w:pStyle w:val="ListBullet"/>
       </w:pPr>
       <w:r>
-        <w:t xml:space="preserve">  **AST Signal**: 45% (Moderate)</w:t>
+        <w:t>AST Signal: 45% (Moderate)</w:t>
       </w:r>
     </w:p>
     <w:p>
@@ -751,7 +799,7 @@
         <w:pStyle w:val="ListBullet"/>
       </w:pPr>
       <w:r>
-        <w:t xml:space="preserve">  **System Result**: **CAUGHT** (detected as "Moderate structural and textual similarity").</w:t>
+        <w:t>System Result: CAUGHT (detected as "Moderate structural and textual similarity").</w:t>
       </w:r>
     </w:p>
     <w:p>
@@ -767,7 +815,7 @@
         <w:pStyle w:val="ListBullet"/>
       </w:pPr>
       <w:r>
-        <w:t xml:space="preserve">  **Tactic**: Student wraps code in a `try/catch` block and adds "Dead Code" (if-statements that will never run).</w:t>
+        <w:t>Tactic: Student wraps code in a `try/catch` block and adds "Dead Code" (if-statements that will never run).</w:t>
       </w:r>
     </w:p>
     <w:p>
@@ -775,7 +823,7 @@
         <w:pStyle w:val="ListBullet"/>
       </w:pPr>
       <w:r>
-        <w:t xml:space="preserve">  **Tokenizer Signal**: 32% (Low)</w:t>
+        <w:t>Tokenizer Signal: 32% (Low)</w:t>
       </w:r>
     </w:p>
     <w:p>
@@ -783,7 +831,7 @@
         <w:pStyle w:val="ListBullet"/>
       </w:pPr>
       <w:r>
-        <w:t xml:space="preserve">  **AST Signal**: 62% (Moderate-High)</w:t>
+        <w:t>AST Signal: 62% (Moderate-High)</w:t>
       </w:r>
     </w:p>
     <w:p>
@@ -791,7 +839,7 @@
         <w:pStyle w:val="ListBullet"/>
       </w:pPr>
       <w:r>
-        <w:t xml:space="preserve">  **System Result**: **CAUGHT** (detected as "High structural similarity").</w:t>
+        <w:t>System Result: CAUGHT (detected as "High structural similarity").</w:t>
       </w:r>
     </w:p>
     <w:p>
@@ -832,47 +880,47 @@
     </w:p>
     <w:p>
       <w:r>
-        <w:t xml:space="preserve">  "batch_id": "assignment_02",</w:t>
+        <w:t>"batch_id": "assignment_02",</w:t>
       </w:r>
     </w:p>
     <w:p>
       <w:r>
-        <w:t xml:space="preserve">  "submissions": [</w:t>
+        <w:t>"submissions": [</w:t>
       </w:r>
     </w:p>
     <w:p>
       <w:r>
-        <w:t xml:space="preserve">    {</w:t>
+        <w:t>{</w:t>
       </w:r>
     </w:p>
     <w:p>
       <w:r>
-        <w:t xml:space="preserve">      "candidate_id": "user_1",</w:t>
+        <w:t>"candidate_id": "user_1",</w:t>
       </w:r>
     </w:p>
     <w:p>
       <w:r>
-        <w:t xml:space="preserve">      "question_id": "q1",</w:t>
+        <w:t>"question_id": "q1",</w:t>
       </w:r>
     </w:p>
     <w:p>
       <w:r>
-        <w:t xml:space="preserve">      "language": "python",</w:t>
+        <w:t>"language": "python",</w:t>
       </w:r>
     </w:p>
     <w:p>
       <w:r>
-        <w:t xml:space="preserve">      "source_code": "..."</w:t>
+        <w:t>"source_code": "..."</w:t>
       </w:r>
     </w:p>
     <w:p>
       <w:r>
-        <w:t xml:space="preserve">    }</w:t>
+        <w:t>}</w:t>
       </w:r>
     </w:p>
     <w:p>
       <w:r>
-        <w:t xml:space="preserve">  ]</w:t>
+        <w:t>]</w:t>
       </w:r>
     </w:p>
     <w:p>
@@ -890,7 +938,7 @@
         <w:pStyle w:val="ListBullet"/>
       </w:pPr>
       <w:r>
-        <w:t xml:space="preserve">  `Exact match`: 100% overlap.</w:t>
+        <w:t>`Exact match`: 100% overlap.</w:t>
       </w:r>
     </w:p>
     <w:p>
@@ -898,7 +946,7 @@
         <w:pStyle w:val="ListBullet"/>
       </w:pPr>
       <w:r>
-        <w:t xml:space="preserve">  `Near-identical text`: &gt;90% textual similarity.</w:t>
+        <w:t>`Near-identical text`: &gt;90% textual similarity.</w:t>
       </w:r>
     </w:p>
     <w:p>
@@ -906,7 +954,7 @@
         <w:pStyle w:val="ListBullet"/>
       </w:pPr>
       <w:r>
-        <w:t xml:space="preserve">  `Low text overlap, high structural similarity`: The hallmark of a "Smart Copy."</w:t>
+        <w:t>`Low text overlap, high structural similarity`: The hallmark of a "Smart Copy."</w:t>
       </w:r>
     </w:p>
     <w:p>
@@ -914,7 +962,7 @@
         <w:pStyle w:val="ListBullet"/>
       </w:pPr>
       <w:r>
-        <w:t xml:space="preserve">  `Likely original`: No significant signals found.</w:t>
+        <w:t>`Likely original`: No significant signals found.</w:t>
       </w:r>
     </w:p>
     <w:p>
@@ -975,7 +1023,7 @@
         <w:pStyle w:val="ListBullet"/>
       </w:pPr>
       <w:r>
-        <w:t xml:space="preserve">  **Run Showcase**: `python demo_for_team_leader.py`</w:t>
+        <w:t>Run Showcase: `python demo_for_team_leader.py`</w:t>
       </w:r>
     </w:p>
     <w:p>
@@ -983,7 +1031,7 @@
         <w:pStyle w:val="ListBullet"/>
       </w:pPr>
       <w:r>
-        <w:t xml:space="preserve">  **Run API**: `uvicorn main:app --reload`</w:t>
+        <w:t>Run API: `uvicorn main:app --reload`</w:t>
       </w:r>
     </w:p>
     <w:p>
@@ -1014,7 +1062,7 @@
         <w:pStyle w:val="ListNumber"/>
       </w:pPr>
       <w:r>
-        <w:t>**Semantic Embeddings**: Using CodeBERT to catch logic reordering that even ASTs might miss.</w:t>
+        <w:t>Semantic Embeddings: Using CodeBERT to catch logic reordering that even ASTs might miss.</w:t>
       </w:r>
     </w:p>
     <w:p>
@@ -1022,7 +1070,7 @@
         <w:pStyle w:val="ListNumber"/>
       </w:pPr>
       <w:r>
-        <w:t>**Boilerplate Filtering**: Automatically ignoring code provided as part of an assignment template.</w:t>
+        <w:t>Boilerplate Filtering: Automatically ignoring code provided as part of an assignment template.</w:t>
       </w:r>
     </w:p>
     <w:p>
@@ -1030,7 +1078,7 @@
         <w:pStyle w:val="ListNumber"/>
       </w:pPr>
       <w:r>
-        <w:t>**Side-by-Side Highlighting**: A visual diff report for management review.</w:t>
+        <w:t>Side-by-Side Highlighting: A visual diff report for management review.</w:t>
       </w:r>
     </w:p>
     <w:p>

</xml_diff>